<commit_message>
Correct 0.1–0.4 assumptions and convergence conditions; publish exact verification and bilingual 0.6-r1 series metadata
</commit_message>
<xml_diff>
--- a/paper/WRRA_M_0_1_EN.docx
+++ b/paper/WRRA_M_0_1_EN.docx
@@ -220,7 +220,7 @@
                 <w:rFonts w:ascii="Aptos" w:hAnsi="Aptos"/>
                 <w:sz w:val="20"/>
               </w:rPr>
-              <w:t>WRRA-M 0.1</w:t>
+              <w:t>WRRA-M 0.1-r1</w:t>
             </w:r>
           </w:p>
         </w:tc>
@@ -264,7 +264,7 @@
                 <w:rFonts w:ascii="Aptos" w:hAnsi="Aptos"/>
                 <w:sz w:val="20"/>
               </w:rPr>
-              <w:t>30 September 2026</w:t>
+              <w:t>1 October 2026</w:t>
             </w:r>
           </w:p>
         </w:tc>
@@ -2085,9 +2085,7 @@
       </w:r>
     </w:p>
     <w:p>
-      <w:r>
-        <w:br w:type="page"/>
-      </w:r>
+      <w:r/>
     </w:p>
     <w:p>
       <w:pPr>
@@ -2534,7 +2532,13 @@
           <w:rFonts w:ascii="Aptos" w:hAnsi="Aptos"/>
           <w:i w:val="0"/>
         </w:rPr>
-        <w:t>The central calculation begins with a G2 structured seven degree sector. The fundamental seven dimensional representation branches under the SU(3) subgroup into a color triplet, an antitriplet, and a singlet [5]. WRRA-M introduces two oriented copies of the seven sector plus one invariant channel. The two copies are provisionally interpreted as a state sector and a residue dual sector. Their physical distinction must later be derived from the transition law.</w:t>
+        <w:t>The central calculation begins with the real seven-dimensional fundamental representation of compact G2 [8]. Its complexification restricts to the SU(3) subgroup as a color triplet, an antitriplet, and a singlet [5]. WRRA-M introduces two oriented copies of this complexified sector plus one invariant channel. The two copies are provisionally interpreted as a state sector and a residue-dual sector; their physical distinction remains to be derived from a transition law.</w:t>
+      </w:r>
+    </w:p>
+    <w:p>
+      <w:pPr/>
+      <w:r>
+        <w:t>Representation-to-channel assumption. To interpret the fifteen complex color components as particle channels, WRRA-M separately assigns independent complex left-handed Weyl fields to them. It does not impose the original real-representation conjugation as a reality constraint identifying the triplet and antitriplet fields. Complexification and this chirality assignment are physical modeling assumptions, not consequences of the color branching. The exact color multiplicities therefore do not derive physical chirality.</w:t>
       </w:r>
     </w:p>
     <w:p>
@@ -6187,6 +6191,12 @@
       </w:r>
     </w:p>
     <w:p>
+      <w:pPr/>
+      <w:r>
+        <w:t>Reproduction: calculations/verify_wrra_m_0_1.py checks the SU(3) torus characters, the 15-component color count, and the calibrated anomaly benchmark with exact arithmetic. It treats the G2 branching as an established input and does not test physical chirality.</w:t>
+      </w:r>
+    </w:p>
+    <w:p>
       <w:pPr>
         <w:pStyle w:val="Heading1"/>
       </w:pPr>
@@ -6196,21 +6206,22 @@
     </w:p>
     <w:p>
       <w:pPr>
-        <w:spacing w:after="140"/>
+        <w:keepNext/>
+        <w:spacing w:after="80" w:line="240" w:lineRule="auto"/>
         <w:ind w:left="259" w:hanging="259"/>
       </w:pPr>
       <w:r>
         <w:rPr>
           <w:rFonts w:ascii="Aptos" w:hAnsi="Aptos"/>
           <w:b/>
-          <w:sz w:val="19"/>
+          <w:sz w:val="18"/>
         </w:rPr>
         <w:t xml:space="preserve">[1] </w:t>
       </w:r>
       <w:r>
         <w:rPr>
           <w:rFonts w:ascii="Aptos" w:hAnsi="Aptos"/>
-          <w:sz w:val="19"/>
+          <w:sz w:val="18"/>
         </w:rPr>
         <w:t>Edward Witten  String Theory Dynamics in Various Dimensions  Nuclear Physics B 443 1995 85 to 126</w:t>
         <w:br/>
@@ -6219,28 +6230,29 @@
         <w:rPr>
           <w:rFonts w:ascii="Aptos" w:hAnsi="Aptos"/>
           <w:color w:val="245A83"/>
-          <w:sz w:val="17"/>
+          <w:sz w:val="18"/>
         </w:rPr>
         <w:t>https://arxiv.org/abs/hep-th/9503124</w:t>
       </w:r>
     </w:p>
     <w:p>
       <w:pPr>
-        <w:spacing w:after="140"/>
+        <w:keepNext/>
+        <w:spacing w:after="80" w:line="240" w:lineRule="auto"/>
         <w:ind w:left="259" w:hanging="259"/>
       </w:pPr>
       <w:r>
         <w:rPr>
           <w:rFonts w:ascii="Aptos" w:hAnsi="Aptos"/>
           <w:b/>
-          <w:sz w:val="19"/>
+          <w:sz w:val="18"/>
         </w:rPr>
         <w:t xml:space="preserve">[2] </w:t>
       </w:r>
       <w:r>
         <w:rPr>
           <w:rFonts w:ascii="Aptos" w:hAnsi="Aptos"/>
-          <w:sz w:val="19"/>
+          <w:sz w:val="18"/>
         </w:rPr>
         <w:t>Aaron Kennon  G2 Manifolds and M Theory Compactifications  2018</w:t>
         <w:br/>
@@ -6249,28 +6261,29 @@
         <w:rPr>
           <w:rFonts w:ascii="Aptos" w:hAnsi="Aptos"/>
           <w:color w:val="245A83"/>
-          <w:sz w:val="17"/>
+          <w:sz w:val="18"/>
         </w:rPr>
         <w:t>https://arxiv.org/abs/1810.12659</w:t>
       </w:r>
     </w:p>
     <w:p>
       <w:pPr>
-        <w:spacing w:after="140"/>
+        <w:keepNext/>
+        <w:spacing w:after="80" w:line="240" w:lineRule="auto"/>
         <w:ind w:left="259" w:hanging="259"/>
       </w:pPr>
       <w:r>
         <w:rPr>
           <w:rFonts w:ascii="Aptos" w:hAnsi="Aptos"/>
           <w:b/>
-          <w:sz w:val="19"/>
+          <w:sz w:val="18"/>
         </w:rPr>
         <w:t xml:space="preserve">[3] </w:t>
       </w:r>
       <w:r>
         <w:rPr>
           <w:rFonts w:ascii="Aptos" w:hAnsi="Aptos"/>
-          <w:sz w:val="19"/>
+          <w:sz w:val="18"/>
         </w:rPr>
         <w:t>Bobby Acharya and Edward Witten  Chiral Fermions from Manifolds of G2 Holonomy  2001</w:t>
         <w:br/>
@@ -6279,28 +6292,29 @@
         <w:rPr>
           <w:rFonts w:ascii="Aptos" w:hAnsi="Aptos"/>
           <w:color w:val="245A83"/>
-          <w:sz w:val="17"/>
+          <w:sz w:val="18"/>
         </w:rPr>
         <w:t>https://arxiv.org/abs/hep-th/0109152</w:t>
       </w:r>
     </w:p>
     <w:p>
       <w:pPr>
-        <w:spacing w:after="140"/>
+        <w:keepNext/>
+        <w:spacing w:after="80" w:line="240" w:lineRule="auto"/>
         <w:ind w:left="259" w:hanging="259"/>
       </w:pPr>
       <w:r>
         <w:rPr>
           <w:rFonts w:ascii="Aptos" w:hAnsi="Aptos"/>
           <w:b/>
-          <w:sz w:val="19"/>
+          <w:sz w:val="18"/>
         </w:rPr>
         <w:t xml:space="preserve">[4] </w:t>
       </w:r>
       <w:r>
         <w:rPr>
           <w:rFonts w:ascii="Aptos" w:hAnsi="Aptos"/>
-          <w:sz w:val="19"/>
+          <w:sz w:val="18"/>
         </w:rPr>
         <w:t>Edward Witten  Anomaly Cancellation on Manifolds of G2 Holonomy  2001</w:t>
         <w:br/>
@@ -6309,28 +6323,29 @@
         <w:rPr>
           <w:rFonts w:ascii="Aptos" w:hAnsi="Aptos"/>
           <w:color w:val="245A83"/>
-          <w:sz w:val="17"/>
+          <w:sz w:val="18"/>
         </w:rPr>
         <w:t>https://arxiv.org/abs/hep-th/0108165</w:t>
       </w:r>
     </w:p>
     <w:p>
       <w:pPr>
-        <w:spacing w:after="140"/>
+        <w:keepNext/>
+        <w:spacing w:after="80" w:line="240" w:lineRule="auto"/>
         <w:ind w:left="259" w:hanging="259"/>
       </w:pPr>
       <w:r>
         <w:rPr>
           <w:rFonts w:ascii="Aptos" w:hAnsi="Aptos"/>
           <w:b/>
-          <w:sz w:val="19"/>
+          <w:sz w:val="18"/>
         </w:rPr>
         <w:t xml:space="preserve">[5] </w:t>
       </w:r>
       <w:r>
         <w:rPr>
           <w:rFonts w:ascii="Aptos" w:hAnsi="Aptos"/>
-          <w:sz w:val="19"/>
+          <w:sz w:val="18"/>
         </w:rPr>
         <w:t>An exceptional G2 extension of the Standard Model from Cayley Dickson automorphism groups  Scientific Reports 2021</w:t>
         <w:br/>
@@ -6339,28 +6354,29 @@
         <w:rPr>
           <w:rFonts w:ascii="Aptos" w:hAnsi="Aptos"/>
           <w:color w:val="245A83"/>
-          <w:sz w:val="17"/>
+          <w:sz w:val="18"/>
         </w:rPr>
         <w:t>https://doi.org/10.1038/s41598-021-01814-1</w:t>
       </w:r>
     </w:p>
     <w:p>
       <w:pPr>
-        <w:spacing w:after="140"/>
+        <w:keepNext/>
+        <w:spacing w:after="80" w:line="240" w:lineRule="auto"/>
         <w:ind w:left="259" w:hanging="259"/>
       </w:pPr>
       <w:r>
         <w:rPr>
           <w:rFonts w:ascii="Aptos" w:hAnsi="Aptos"/>
           <w:b/>
-          <w:sz w:val="19"/>
+          <w:sz w:val="18"/>
         </w:rPr>
         <w:t xml:space="preserve">[6] </w:t>
       </w:r>
       <w:r>
         <w:rPr>
           <w:rFonts w:ascii="Aptos" w:hAnsi="Aptos"/>
-          <w:sz w:val="19"/>
+          <w:sz w:val="18"/>
         </w:rPr>
         <w:t>CERN  The Standard Model of Particle Physics  CERN 2016 005</w:t>
         <w:br/>
@@ -6369,28 +6385,29 @@
         <w:rPr>
           <w:rFonts w:ascii="Aptos" w:hAnsi="Aptos"/>
           <w:color w:val="245A83"/>
-          <w:sz w:val="17"/>
+          <w:sz w:val="18"/>
         </w:rPr>
         <w:t>https://cds.cern.ch/record/1966030</w:t>
       </w:r>
     </w:p>
     <w:p>
       <w:pPr>
-        <w:spacing w:after="140"/>
+        <w:keepNext/>
+        <w:spacing w:after="80" w:line="240" w:lineRule="auto"/>
         <w:ind w:left="259" w:hanging="259"/>
       </w:pPr>
       <w:r>
         <w:rPr>
           <w:rFonts w:ascii="Aptos" w:hAnsi="Aptos"/>
           <w:b/>
-          <w:sz w:val="19"/>
+          <w:sz w:val="18"/>
         </w:rPr>
         <w:t xml:space="preserve">[7] </w:t>
       </w:r>
       <w:r>
         <w:rPr>
           <w:rFonts w:ascii="Aptos" w:hAnsi="Aptos"/>
-          <w:sz w:val="19"/>
+          <w:sz w:val="18"/>
         </w:rPr>
         <w:t>Particle Data Group  Standard Model and Related Topics  2025</w:t>
         <w:br/>
@@ -6399,9 +6416,21 @@
         <w:rPr>
           <w:rFonts w:ascii="Aptos" w:hAnsi="Aptos"/>
           <w:color w:val="245A83"/>
-          <w:sz w:val="17"/>
+          <w:sz w:val="18"/>
         </w:rPr>
         <w:t>https://pdg.lbl.gov/2025/reviews/standard_model_and_related.html</w:t>
+      </w:r>
+    </w:p>
+    <w:p>
+      <w:pPr>
+        <w:keepNext w:val="0"/>
+        <w:spacing w:line="240" w:lineRule="auto" w:after="80"/>
+      </w:pPr>
+      <w:r>
+        <w:rPr>
+          <w:sz w:val="18"/>
+        </w:rPr>
+        <w:t>[8] John C. Baez. The Octonions. Bulletin of the American Mathematical Society 39 (2002), 145-205. Section 4.1. https://arxiv.org/abs/math/0105155</w:t>
       </w:r>
     </w:p>
     <w:sectPr>

</xml_diff>